<commit_message>
Replace speech-duration ack heuristic with real processing-time timer (v0.4.6)
Reported live (driving): saying "yes" to the daily brief offer, and
some ordinary short commands, produced dead silence with no "one
moment" acknowledgment before the answer. Root cause: the daily-brief
reply had no ack logic at all, and the general loop's ack was gated
on how long Boaz spoke (>2.5s), which doesn't predict how much
backend work follows. Replaced both with one shared timer on the
actual work (mirrors the manual-run delayed-reveal pattern) - skips
the ack under ~4s, fires it if real work is still running past that.
</commit_message>
<xml_diff>
--- a/Myday Release Notes.docx
+++ b/Myday Release Notes.docx
@@ -37,6 +37,70 @@
       </w:r>
       <w:r>
         <w:t xml:space="preserve"> in app/build.gradle.kts (app/build.gradle.kts). This file is the source of truth for what changed between versions — update it (and bump the version) alongside any meaningful batch of work, not on every single commit.</w:t>
+      </w:r>
+    </w:p>
+    <w:p>
+      <w:pPr>
+        <w:spacing w:before="200" w:after="120"/>
+      </w:pPr>
+      <w:r>
+        <w:rPr>
+          <w:rFonts w:ascii="Arial" w:hAnsi="Arial"/>
+          <w:b/>
+          <w:color w:val="1155CC"/>
+          <w:sz w:val="30"/>
+        </w:rPr>
+        <w:t>0.4.6 — 2026-09-10</w:t>
+      </w:r>
+    </w:p>
+    <w:p>
+      <w:r>
+        <w:rPr>
+          <w:b/>
+        </w:rPr>
+        <w:t>"Working on your request" silence, fixed properly - replaced a broken heuristic with a real one.</w:t>
+      </w:r>
+    </w:p>
+    <w:p>
+      <w:pPr>
+        <w:pStyle w:val="ListBullet"/>
+      </w:pPr>
+      <w:r>
+        <w:t>Reported live: saying "yes" to the daily brief offer while driving produced long dead silence before the brief started, with no "one moment" acknowledgment - and the same silence sometimes happened on ordinary short commands too.</w:t>
+      </w:r>
+    </w:p>
+    <w:p>
+      <w:pPr>
+        <w:pStyle w:val="ListBullet"/>
+      </w:pPr>
+      <w:r>
+        <w:t xml:space="preserve">Root cause, in two parts. First, the daily-brief "yes" reply never had any acknowledgment logic wired to it at all - it went straight into a full weather+calendar+email+Claude round trip with nothing spoken the entire time. Second, the general conversation loop's ack </w:t>
+      </w:r>
+      <w:r>
+        <w:rPr>
+          <w:i/>
+        </w:rPr>
+        <w:t>did</w:t>
+      </w:r>
+      <w:r>
+        <w:t xml:space="preserve"> exist, but was gated on how long Boaz's own utterance was (over 2.5s of speech = ack, under = silence) - a heuristic that doesn't actually predict how much backend work follows. A brisk "what's my next meeting" is short to say but still needs a real Calendar+Claude round trip.</w:t>
+      </w:r>
+    </w:p>
+    <w:p>
+      <w:pPr>
+        <w:pStyle w:val="ListBullet"/>
+      </w:pPr>
+      <w:r>
+        <w:t xml:space="preserve">Replaced the speech-duration guess entirely with a timer on the </w:t>
+      </w:r>
+      <w:r>
+        <w:rPr>
+          <w:i/>
+        </w:rPr>
+        <w:t>actual processing work</w:t>
+      </w:r>
+      <w:r>
+        <w:t xml:space="preserve"> - mirrors the same delayed-reveal pattern already used for manual-run results in the app UI. The "one moment" only fires if the real work hasn't finished within a few seconds, and never fires at all if it resolves quickly - matching the explicit rule this was built to: skip the ack under ~3-4s, make sure it fires above ~5s. One shared mechanism now covers both the daily brief and every ordinary command, rather than two different (and one entirely missing) implementations.</w:t>
       </w:r>
     </w:p>
     <w:p>

</xml_diff>

<commit_message>
Add live progress to the 30-day email cleanup manual run (v0.4.7)
The deep run can take 5-6 minutes with no way to tell progress from a
stall. Worker now reports progress via WorkManager's setProgress
after each email; the manual-run dialog observes it live and shows
"Checked N of M (X%) - about Ym Zs remaining", extrapolated from
elapsed time once a few items have been processed.
</commit_message>
<xml_diff>
--- a/Myday Release Notes.docx
+++ b/Myday Release Notes.docx
@@ -37,6 +37,61 @@
       </w:r>
       <w:r>
         <w:t xml:space="preserve"> in app/build.gradle.kts (app/build.gradle.kts). This file is the source of truth for what changed between versions — update it (and bump the version) alongside any meaningful batch of work, not on every single commit.</w:t>
+      </w:r>
+    </w:p>
+    <w:p>
+      <w:pPr>
+        <w:spacing w:before="200" w:after="120"/>
+      </w:pPr>
+      <w:r>
+        <w:rPr>
+          <w:rFonts w:ascii="Arial" w:hAnsi="Arial"/>
+          <w:b/>
+          <w:color w:val="1155CC"/>
+          <w:sz w:val="30"/>
+        </w:rPr>
+        <w:t>0.4.7 — 2026-09-10</w:t>
+      </w:r>
+    </w:p>
+    <w:p>
+      <w:r>
+        <w:rPr>
+          <w:b/>
+        </w:rPr>
+        <w:t>Live progress for the 30-day email cleanup, instead of a static "working on it" for 5-6 minutes.</w:t>
+      </w:r>
+    </w:p>
+    <w:p>
+      <w:pPr>
+        <w:pStyle w:val="ListBullet"/>
+      </w:pPr>
+      <w:r>
+        <w:t>The deep run can process up to 200 emails, some needing their own Claude classification call - genuinely a several-minute run, during which the manual-run dialog previously just said "Working on it…" the entire time, indistinguishable from a stall.</w:t>
+      </w:r>
+    </w:p>
+    <w:p>
+      <w:pPr>
+        <w:pStyle w:val="ListBullet"/>
+      </w:pPr>
+      <w:r>
+        <w:t>The worker now reports progress via WorkManager's own progress mechanism (</w:t>
+      </w:r>
+      <w:r>
+        <w:rPr>
+          <w:rFonts w:ascii="Consolas" w:hAnsi="Consolas"/>
+        </w:rPr>
+        <w:t>setProgress</w:t>
+      </w:r>
+      <w:r>
+        <w:t>) after each email; the dialog observes it live and shows "Checked 84 of 187 email(s) (44%) — about 2m 10s remaining", updating continuously. The remaining-time estimate only appears after a few emails have been processed (extrapolating from 1-2 is too noisy to be useful) and is a simple linear projection from elapsed time so far.</w:t>
+      </w:r>
+    </w:p>
+    <w:p>
+      <w:pPr>
+        <w:pStyle w:val="ListBullet"/>
+      </w:pPr>
+      <w:r>
+        <w:t>Every other manual run is unaffected - this only applies where a progressFlow is actually wired in.</w:t>
       </w:r>
     </w:p>
     <w:p>

</xml_diff>